<commit_message>
Finish resume copilot MVP
</commit_message>
<xml_diff>
--- a/user_guide.docx
+++ b/user_guide.docx
@@ -15,12 +15,12 @@
         <w:pStyle w:val="Heading1"/>
       </w:pPr>
       <w:r>
-        <w:t>Getting Started</w:t>
+        <w:t>Overview</w:t>
       </w:r>
     </w:p>
     <w:p>
       <w:r>
-        <w:t>Start a session and input your experience.</w:t>
+        <w:t>Resume Co-Pilot helps you turn a rough career story into a resume draft in one working session. You can start by typing, uploading a file, or using browser voice dictation.</w:t>
       </w:r>
     </w:p>
     <w:p>
@@ -28,12 +28,22 @@
         <w:pStyle w:val="Heading1"/>
       </w:pPr>
       <w:r>
-        <w:t>Conversation</w:t>
+        <w:t>Start A Session</w:t>
       </w:r>
     </w:p>
     <w:p>
       <w:r>
-        <w:t>Answer questions naturally.</w:t>
+        <w:t>1. Open the app and begin on the welcome screen.</w:t>
+      </w:r>
+    </w:p>
+    <w:p>
+      <w:r>
+        <w:t>2. Choose one input method: type your background, upload a TXT, MD, DOCX, or PDF file, or use microphone dictation if your browser supports it.</w:t>
+      </w:r>
+    </w:p>
+    <w:p>
+      <w:r>
+        <w:t>3. Continue into the main workspace and review the large brain-dump text area.</w:t>
       </w:r>
     </w:p>
     <w:p>
@@ -41,12 +51,27 @@
         <w:pStyle w:val="Heading1"/>
       </w:pPr>
       <w:r>
-        <w:t>Review</w:t>
+        <w:t>Extract Facts</w:t>
       </w:r>
     </w:p>
     <w:p>
       <w:r>
-        <w:t>Check extracted facts and missing info.</w:t>
+        <w:t>1. Click Extract Facts to generate structured facts and follow-up questions.</w:t>
+      </w:r>
+    </w:p>
+    <w:p>
+      <w:r>
+        <w:t>2. Review the extracted facts carefully.</w:t>
+      </w:r>
+    </w:p>
+    <w:p>
+      <w:r>
+        <w:t>3. Edit, add, or remove facts if the system missed important details or wording.</w:t>
+      </w:r>
+    </w:p>
+    <w:p>
+      <w:r>
+        <w:t>4. Save facts or refresh questions after making fact edits so the rest of the session stays in sync.</w:t>
       </w:r>
     </w:p>
     <w:p>
@@ -54,12 +79,17 @@
         <w:pStyle w:val="Heading1"/>
       </w:pPr>
       <w:r>
-        <w:t>Build Resume</w:t>
+        <w:t>Answer Follow-Up Questions</w:t>
       </w:r>
     </w:p>
     <w:p>
       <w:r>
-        <w:t>Click build when ready.</w:t>
+        <w:t>1. Fill in the targeted follow-up questions about impact, tools, and target role.</w:t>
+      </w:r>
+    </w:p>
+    <w:p>
+      <w:r>
+        <w:t>2. Click Build Resume Draft to create the first draft.</w:t>
       </w:r>
     </w:p>
     <w:p>
@@ -67,12 +97,100 @@
         <w:pStyle w:val="Heading1"/>
       </w:pPr>
       <w:r>
-        <w:t>Export</w:t>
+        <w:t>Review And Finalize</w:t>
       </w:r>
     </w:p>
     <w:p>
       <w:r>
-        <w:t>Download resume and transcript.</w:t>
+        <w:t>1. Review the session transcript and draft output.</w:t>
+      </w:r>
+    </w:p>
+    <w:p>
+      <w:r>
+        <w:t>2. Click Review Transcript + Draft for an AI review pass.</w:t>
+      </w:r>
+    </w:p>
+    <w:p>
+      <w:r>
+        <w:t>3. Enter final change requests if you want a stronger summary or different emphasis.</w:t>
+      </w:r>
+    </w:p>
+    <w:p>
+      <w:r>
+        <w:t>4. Click Prepare Final Resume to generate the final version.</w:t>
+      </w:r>
+    </w:p>
+    <w:p>
+      <w:pPr>
+        <w:pStyle w:val="Heading1"/>
+      </w:pPr>
+      <w:r>
+        <w:t>Download And Export</w:t>
+      </w:r>
+    </w:p>
+    <w:p>
+      <w:r>
+        <w:t>You can download or export the current result in these formats:</w:t>
+      </w:r>
+    </w:p>
+    <w:p>
+      <w:pPr>
+        <w:pStyle w:val="ListBullet"/>
+      </w:pPr>
+      <w:r>
+        <w:t>Markdown</w:t>
+      </w:r>
+    </w:p>
+    <w:p>
+      <w:pPr>
+        <w:pStyle w:val="ListBullet"/>
+      </w:pPr>
+      <w:r>
+        <w:t>JSON</w:t>
+      </w:r>
+    </w:p>
+    <w:p>
+      <w:pPr>
+        <w:pStyle w:val="ListBullet"/>
+      </w:pPr>
+      <w:r>
+        <w:t>DOCX</w:t>
+      </w:r>
+    </w:p>
+    <w:p>
+      <w:pPr>
+        <w:pStyle w:val="ListBullet"/>
+      </w:pPr>
+      <w:r>
+        <w:t>PDF</w:t>
+      </w:r>
+    </w:p>
+    <w:p>
+      <w:r>
+        <w:t>You can also download the session transcript separately.</w:t>
+      </w:r>
+    </w:p>
+    <w:p>
+      <w:pPr>
+        <w:pStyle w:val="Heading1"/>
+      </w:pPr>
+      <w:r>
+        <w:t>Session Notes</w:t>
+      </w:r>
+    </w:p>
+    <w:p>
+      <w:r>
+        <w:t>Sessions are temporary and expire automatically. The interface shows the current session expiry time.</w:t>
+      </w:r>
+    </w:p>
+    <w:p>
+      <w:r>
+        <w:t>If a session expires, the app restores your locally saved text and starts a fresh session when possible.</w:t>
+      </w:r>
+    </w:p>
+    <w:p>
+      <w:r>
+        <w:t>If OpenAI is unavailable, the app falls back to a local draft and review flow so you can continue working.</w:t>
       </w:r>
     </w:p>
     <w:sectPr>

</xml_diff>

<commit_message>
Improve user guidance and welcome flow
</commit_message>
<xml_diff>
--- a/user_guide.docx
+++ b/user_guide.docx
@@ -11,16 +11,8 @@
       </w:r>
     </w:p>
     <w:p>
-      <w:pPr>
-        <w:pStyle w:val="Heading1"/>
-      </w:pPr>
       <w:r>
-        <w:t>Overview</w:t>
-      </w:r>
-    </w:p>
-    <w:p>
-      <w:r>
-        <w:t>Resume Co-Pilot helps you turn a rough career story into a resume draft in one working session. You can start by typing, uploading a file, or using browser voice dictation.</w:t>
+        <w:t>Welcome to Resume Co-Pilot. This application helps you turn a rough career story into a polished resume draft in one guided session. It is designed to feel approachable even if you do not have a finished resume yet.</w:t>
       </w:r>
     </w:p>
     <w:p>
@@ -28,22 +20,12 @@
         <w:pStyle w:val="Heading1"/>
       </w:pPr>
       <w:r>
-        <w:t>Start A Session</w:t>
+        <w:t>What The Application Does</w:t>
       </w:r>
     </w:p>
     <w:p>
       <w:r>
-        <w:t>1. Open the app and begin on the welcome screen.</w:t>
-      </w:r>
-    </w:p>
-    <w:p>
-      <w:r>
-        <w:t>2. Choose one input method: type your background, upload a TXT, MD, DOCX, or PDF file, or use microphone dictation if your browser supports it.</w:t>
-      </w:r>
-    </w:p>
-    <w:p>
-      <w:r>
-        <w:t>3. Continue into the main workspace and review the large brain-dump text area.</w:t>
+        <w:t>Resume Co-Pilot collects your background, extracts useful facts, asks focused follow-up questions, builds a draft, improves it through review, and lets you export the result in multiple formats.</w:t>
       </w:r>
     </w:p>
     <w:p>
@@ -51,27 +33,49 @@
         <w:pStyle w:val="Heading1"/>
       </w:pPr>
       <w:r>
-        <w:t>Extract Facts</w:t>
+        <w:t>Step 1 - Start In The Easiest Way For You</w:t>
       </w:r>
     </w:p>
     <w:p>
       <w:r>
-        <w:t>1. Click Extract Facts to generate structured facts and follow-up questions.</w:t>
+        <w:t>When you open the app, you begin on the welcome screen.</w:t>
+      </w:r>
+    </w:p>
+    <w:p>
+      <w:pPr>
+        <w:pStyle w:val="ListBullet"/>
+      </w:pPr>
+      <w:r>
+        <w:t>You can start by typing your story, uploading an existing file, or using browser voice dictation.</w:t>
+      </w:r>
+    </w:p>
+    <w:p>
+      <w:pPr>
+        <w:pStyle w:val="ListBullet"/>
+      </w:pPr>
+      <w:r>
+        <w:t>Typing is useful if you want full control.</w:t>
+      </w:r>
+    </w:p>
+    <w:p>
+      <w:pPr>
+        <w:pStyle w:val="ListBullet"/>
+      </w:pPr>
+      <w:r>
+        <w:t>Upload is useful if you already have resume notes, an old resume, or a draft file.</w:t>
+      </w:r>
+    </w:p>
+    <w:p>
+      <w:pPr>
+        <w:pStyle w:val="ListBullet"/>
+      </w:pPr>
+      <w:r>
+        <w:t>Voice is useful if speaking is easier than writing.</w:t>
       </w:r>
     </w:p>
     <w:p>
       <w:r>
-        <w:t>2. Review the extracted facts carefully.</w:t>
-      </w:r>
-    </w:p>
-    <w:p>
-      <w:r>
-        <w:t>3. Edit, add, or remove facts if the system missed important details or wording.</w:t>
-      </w:r>
-    </w:p>
-    <w:p>
-      <w:r>
-        <w:t>4. Save facts or refresh questions after making fact edits so the rest of the session stays in sync.</w:t>
+        <w:t>At this stage, the goal is not perfection. Just get your experience, strengths, tools, and goals into the app.</w:t>
       </w:r>
     </w:p>
     <w:p>
@@ -79,17 +83,22 @@
         <w:pStyle w:val="Heading1"/>
       </w:pPr>
       <w:r>
-        <w:t>Answer Follow-Up Questions</w:t>
+        <w:t>Step 2 - Extract Facts</w:t>
       </w:r>
     </w:p>
     <w:p>
       <w:r>
-        <w:t>1. Fill in the targeted follow-up questions about impact, tools, and target role.</w:t>
+        <w:t>After your story is ready, click Extract Facts.</w:t>
       </w:r>
     </w:p>
     <w:p>
       <w:r>
-        <w:t>2. Click Build Resume Draft to create the first draft.</w:t>
+        <w:t>The application turns your background into structured facts that are easier to review than a large paragraph.</w:t>
+      </w:r>
+    </w:p>
+    <w:p>
+      <w:r>
+        <w:t>This helps prepare the strongest raw material for the resume draft.</w:t>
       </w:r>
     </w:p>
     <w:p>
@@ -97,27 +106,41 @@
         <w:pStyle w:val="Heading1"/>
       </w:pPr>
       <w:r>
-        <w:t>Review And Finalize</w:t>
+        <w:t>Step 3 - Review And Edit Facts</w:t>
       </w:r>
     </w:p>
     <w:p>
       <w:r>
-        <w:t>1. Review the session transcript and draft output.</w:t>
+        <w:t>Before building the draft, review the extracted facts carefully.</w:t>
+      </w:r>
+    </w:p>
+    <w:p>
+      <w:pPr>
+        <w:pStyle w:val="ListBullet"/>
+      </w:pPr>
+      <w:r>
+        <w:t>You can edit labels and details if something needs better wording.</w:t>
+      </w:r>
+    </w:p>
+    <w:p>
+      <w:pPr>
+        <w:pStyle w:val="ListBullet"/>
+      </w:pPr>
+      <w:r>
+        <w:t>You can add new facts if something important is missing.</w:t>
+      </w:r>
+    </w:p>
+    <w:p>
+      <w:pPr>
+        <w:pStyle w:val="ListBullet"/>
+      </w:pPr>
+      <w:r>
+        <w:t>You can remove facts that are weak, incorrect, or not useful.</w:t>
       </w:r>
     </w:p>
     <w:p>
       <w:r>
-        <w:t>2. Click Review Transcript + Draft for an AI review pass.</w:t>
-      </w:r>
-    </w:p>
-    <w:p>
-      <w:r>
-        <w:t>3. Enter final change requests if you want a stronger summary or different emphasis.</w:t>
-      </w:r>
-    </w:p>
-    <w:p>
-      <w:r>
-        <w:t>4. Click Prepare Final Resume to generate the final version.</w:t>
+        <w:t>You can save your fact edits and refresh the follow-up questions so the rest of the workflow stays aligned.</w:t>
       </w:r>
     </w:p>
     <w:p>
@@ -125,12 +148,81 @@
         <w:pStyle w:val="Heading1"/>
       </w:pPr>
       <w:r>
-        <w:t>Download And Export</w:t>
+        <w:t>Step 4 - Answer Follow-Up Questions</w:t>
       </w:r>
     </w:p>
     <w:p>
       <w:r>
-        <w:t>You can download or export the current result in these formats:</w:t>
+        <w:t>The app asks targeted follow-up questions to strengthen the draft.</w:t>
+      </w:r>
+    </w:p>
+    <w:p>
+      <w:r>
+        <w:t>These usually focus on impact, tools, responsibilities, and the kind of job you want next.</w:t>
+      </w:r>
+    </w:p>
+    <w:p>
+      <w:r>
+        <w:t>Answer naturally. Short, clear answers are fine.</w:t>
+      </w:r>
+    </w:p>
+    <w:p>
+      <w:pPr>
+        <w:pStyle w:val="Heading1"/>
+      </w:pPr>
+      <w:r>
+        <w:t>Step 5 - Build The Draft</w:t>
+      </w:r>
+    </w:p>
+    <w:p>
+      <w:r>
+        <w:t>When your facts and answers look good, click Build Resume Draft.</w:t>
+      </w:r>
+    </w:p>
+    <w:p>
+      <w:r>
+        <w:t>The application uses the information you provided to create a structured resume draft.</w:t>
+      </w:r>
+    </w:p>
+    <w:p>
+      <w:r>
+        <w:t>If OpenAI is not available, the app still creates a local fallback draft so you can continue working.</w:t>
+      </w:r>
+    </w:p>
+    <w:p>
+      <w:pPr>
+        <w:pStyle w:val="Heading1"/>
+      </w:pPr>
+      <w:r>
+        <w:t>Step 6 - Review And Improve The Draft</w:t>
+      </w:r>
+    </w:p>
+    <w:p>
+      <w:r>
+        <w:t>Once the draft is built, you can review the transcript and the generated resume output.</w:t>
+      </w:r>
+    </w:p>
+    <w:p>
+      <w:r>
+        <w:t>Use Review Transcript + Draft to run an AI review pass that improves clarity, wording, and resume quality.</w:t>
+      </w:r>
+    </w:p>
+    <w:p>
+      <w:r>
+        <w:t>If you want more changes, write them in plain language and click Prepare Final Resume.</w:t>
+      </w:r>
+    </w:p>
+    <w:p>
+      <w:pPr>
+        <w:pStyle w:val="Heading1"/>
+      </w:pPr>
+      <w:r>
+        <w:t>Step 7 - Download And Export</w:t>
+      </w:r>
+    </w:p>
+    <w:p>
+      <w:r>
+        <w:t>When you are happy with the result, you can download the output in the format that works best for you.</w:t>
       </w:r>
     </w:p>
     <w:p>
@@ -138,7 +230,7 @@
         <w:pStyle w:val="ListBullet"/>
       </w:pPr>
       <w:r>
-        <w:t>Markdown</w:t>
+        <w:t>Transcript download</w:t>
       </w:r>
     </w:p>
     <w:p>
@@ -146,7 +238,7 @@
         <w:pStyle w:val="ListBullet"/>
       </w:pPr>
       <w:r>
-        <w:t>JSON</w:t>
+        <w:t>Markdown export</w:t>
       </w:r>
     </w:p>
     <w:p>
@@ -154,7 +246,7 @@
         <w:pStyle w:val="ListBullet"/>
       </w:pPr>
       <w:r>
-        <w:t>DOCX</w:t>
+        <w:t>JSON export</w:t>
       </w:r>
     </w:p>
     <w:p>
@@ -162,12 +254,20 @@
         <w:pStyle w:val="ListBullet"/>
       </w:pPr>
       <w:r>
-        <w:t>PDF</w:t>
+        <w:t>DOCX export</w:t>
+      </w:r>
+    </w:p>
+    <w:p>
+      <w:pPr>
+        <w:pStyle w:val="ListBullet"/>
+      </w:pPr>
+      <w:r>
+        <w:t>PDF export</w:t>
       </w:r>
     </w:p>
     <w:p>
       <w:r>
-        <w:t>You can also download the session transcript separately.</w:t>
+        <w:t>This gives you both editable and shareable versions of the work.</w:t>
       </w:r>
     </w:p>
     <w:p>
@@ -175,22 +275,27 @@
         <w:pStyle w:val="Heading1"/>
       </w:pPr>
       <w:r>
-        <w:t>Session Notes</w:t>
+        <w:t>Helpful Notes</w:t>
       </w:r>
     </w:p>
     <w:p>
       <w:r>
-        <w:t>Sessions are temporary and expire automatically. The interface shows the current session expiry time.</w:t>
+        <w:t>Sessions are temporary and expire automatically.</w:t>
       </w:r>
     </w:p>
     <w:p>
       <w:r>
-        <w:t>If a session expires, the app restores your locally saved text and starts a fresh session when possible.</w:t>
+        <w:t>The app shows the session expiry time so users know the work is not meant to be permanent inside the browser.</w:t>
       </w:r>
     </w:p>
     <w:p>
       <w:r>
-        <w:t>If OpenAI is unavailable, the app falls back to a local draft and review flow so you can continue working.</w:t>
+        <w:t>If a session expires, the app tries to restore saved local text and continue with a fresh session.</w:t>
+      </w:r>
+    </w:p>
+    <w:p>
+      <w:r>
+        <w:t>If you change facts after a draft has already been created, save or refresh them before building, reviewing, or exporting again.</w:t>
       </w:r>
     </w:p>
     <w:sectPr>

</xml_diff>